<commit_message>
Project Outputs für BauhallenUhr_V2.0
</commit_message>
<xml_diff>
--- a/00_Vorlagen_IPA/Altium_Guide.docx
+++ b/00_Vorlagen_IPA/Altium_Guide.docx
@@ -3766,8 +3766,6 @@
           <w:lang w:val="en-GB"/>
         </w:rPr>
       </w:pPr>
-      <w:bookmarkStart w:id="0" w:name="_GoBack"/>
-      <w:bookmarkEnd w:id="0"/>
     </w:p>
     <w:p>
       <w:pPr>
@@ -4077,6 +4075,8 @@
         </w:rPr>
         <w:t>CAMtastic</w:t>
       </w:r>
+      <w:bookmarkStart w:id="0" w:name="_GoBack"/>
+      <w:bookmarkEnd w:id="0"/>
       <w:proofErr w:type="spellEnd"/>
     </w:p>
     <w:p>

</xml_diff>